<commit_message>
MED-8: Update prototype traceability in requirements
Table 7 now maps the 22 prototype pages of the three roles to requirement IDs.
</commit_message>
<xml_diff>
--- a/docs/06-requirements-specification.docx
+++ b/docs/06-requirements-specification.docx
@@ -12815,7 +12815,7 @@
           <w:i w:val="0"/>
           <w:sz w:val="20"/>
         </w:rPr>
-        <w:t>The UI prototype (file 04_UI_Prototype_MedGuard.pdf, 14 pages) shows the doctor flow and the first patient-side screens. The table maps prototype pages to requirements. Page 11 (administration) is to be revised to match Section 3.8: counts, clinics, doctors and journals only.</w:t>
+        <w:t>The UI prototype (file 04_UI_Prototype_MedGuard.pdf, 22 pages) covers the three roles: the doctor flow, the patient screens and the administrator screens. The table maps prototype pages to requirements.</w:t>
       </w:r>
     </w:p>
     <w:p>
@@ -12856,8 +12856,8 @@
       </w:tblPr>
       <w:tblGrid>
         <w:gridCol w:w="907"/>
-        <w:gridCol w:w="4195"/>
-        <w:gridCol w:w="4535"/>
+        <w:gridCol w:w="4762"/>
+        <w:gridCol w:w="3969"/>
       </w:tblGrid>
       <w:tr>
         <w:trPr>
@@ -12884,7 +12884,7 @@
         </w:tc>
         <w:tc>
           <w:tcPr>
-            <w:tcW w:type="dxa" w:w="4195"/>
+            <w:tcW w:type="dxa" w:w="4762"/>
             <w:shd w:val="clear" w:color="auto" w:fill="6B1E3A"/>
           </w:tcPr>
           <w:p>
@@ -12903,7 +12903,7 @@
         </w:tc>
         <w:tc>
           <w:tcPr>
-            <w:tcW w:type="dxa" w:w="4535"/>
+            <w:tcW w:type="dxa" w:w="3969"/>
             <w:shd w:val="clear" w:color="auto" w:fill="6B1E3A"/>
           </w:tcPr>
           <w:p>
@@ -12945,7 +12945,7 @@
         </w:tc>
         <w:tc>
           <w:tcPr>
-            <w:tcW w:type="dxa" w:w="4195"/>
+            <w:tcW w:type="dxa" w:w="4762"/>
           </w:tcPr>
           <w:p>
             <w:pPr>
@@ -12957,13 +12957,13 @@
                 <w:i w:val="0"/>
                 <w:sz w:val="18"/>
               </w:rPr>
-              <w:t>Sign-in with role choice</w:t>
-            </w:r>
-          </w:p>
-        </w:tc>
-        <w:tc>
-          <w:tcPr>
-            <w:tcW w:type="dxa" w:w="4535"/>
+              <w:t>Sign-in with role choice and link to create a profile</w:t>
+            </w:r>
+          </w:p>
+        </w:tc>
+        <w:tc>
+          <w:tcPr>
+            <w:tcW w:type="dxa" w:w="3969"/>
           </w:tcPr>
           <w:p>
             <w:pPr>
@@ -12975,7 +12975,7 @@
                 <w:i w:val="0"/>
                 <w:sz w:val="18"/>
               </w:rPr>
-              <w:t>FR-01</w:t>
+              <w:t>FR-01, FR-04</w:t>
             </w:r>
           </w:p>
         </w:tc>
@@ -13005,7 +13005,7 @@
         </w:tc>
         <w:tc>
           <w:tcPr>
-            <w:tcW w:type="dxa" w:w="4195"/>
+            <w:tcW w:type="dxa" w:w="4762"/>
             <w:shd w:val="clear" w:color="auto" w:fill="F4F1F2"/>
           </w:tcPr>
           <w:p>
@@ -13024,7 +13024,7 @@
         </w:tc>
         <w:tc>
           <w:tcPr>
-            <w:tcW w:type="dxa" w:w="4535"/>
+            <w:tcW w:type="dxa" w:w="3969"/>
             <w:shd w:val="clear" w:color="auto" w:fill="F4F1F2"/>
           </w:tcPr>
           <w:p>
@@ -13066,7 +13066,7 @@
         </w:tc>
         <w:tc>
           <w:tcPr>
-            <w:tcW w:type="dxa" w:w="4195"/>
+            <w:tcW w:type="dxa" w:w="4762"/>
           </w:tcPr>
           <w:p>
             <w:pPr>
@@ -13078,13 +13078,13 @@
                 <w:i w:val="0"/>
                 <w:sz w:val="18"/>
               </w:rPr>
-              <w:t>Patient list with search and status filter</w:t>
-            </w:r>
-          </w:p>
-        </w:tc>
-        <w:tc>
-          <w:tcPr>
-            <w:tcW w:type="dxa" w:w="4535"/>
+              <w:t>Doctor: patient list with search and status filter</w:t>
+            </w:r>
+          </w:p>
+        </w:tc>
+        <w:tc>
+          <w:tcPr>
+            <w:tcW w:type="dxa" w:w="3969"/>
           </w:tcPr>
           <w:p>
             <w:pPr>
@@ -13126,7 +13126,7 @@
         </w:tc>
         <w:tc>
           <w:tcPr>
-            <w:tcW w:type="dxa" w:w="4195"/>
+            <w:tcW w:type="dxa" w:w="4762"/>
             <w:shd w:val="clear" w:color="auto" w:fill="F4F1F2"/>
           </w:tcPr>
           <w:p>
@@ -13139,13 +13139,13 @@
                 <w:i w:val="0"/>
                 <w:sz w:val="18"/>
               </w:rPr>
-              <w:t>Patient history book</w:t>
-            </w:r>
-          </w:p>
-        </w:tc>
-        <w:tc>
-          <w:tcPr>
-            <w:tcW w:type="dxa" w:w="4535"/>
+              <w:t>Doctor: patient history book</w:t>
+            </w:r>
+          </w:p>
+        </w:tc>
+        <w:tc>
+          <w:tcPr>
+            <w:tcW w:type="dxa" w:w="3969"/>
             <w:shd w:val="clear" w:color="auto" w:fill="F4F1F2"/>
           </w:tcPr>
           <w:p>
@@ -13187,7 +13187,7 @@
         </w:tc>
         <w:tc>
           <w:tcPr>
-            <w:tcW w:type="dxa" w:w="4195"/>
+            <w:tcW w:type="dxa" w:w="4762"/>
           </w:tcPr>
           <w:p>
             <w:pPr>
@@ -13199,13 +13199,13 @@
                 <w:i w:val="0"/>
                 <w:sz w:val="18"/>
               </w:rPr>
-              <w:t>Visit record in free text</w:t>
-            </w:r>
-          </w:p>
-        </w:tc>
-        <w:tc>
-          <w:tcPr>
-            <w:tcW w:type="dxa" w:w="4535"/>
+              <w:t>Doctor: visit record in free text</w:t>
+            </w:r>
+          </w:p>
+        </w:tc>
+        <w:tc>
+          <w:tcPr>
+            <w:tcW w:type="dxa" w:w="3969"/>
           </w:tcPr>
           <w:p>
             <w:pPr>
@@ -13247,7 +13247,7 @@
         </w:tc>
         <w:tc>
           <w:tcPr>
-            <w:tcW w:type="dxa" w:w="4195"/>
+            <w:tcW w:type="dxa" w:w="4762"/>
             <w:shd w:val="clear" w:color="auto" w:fill="F4F1F2"/>
           </w:tcPr>
           <w:p>
@@ -13260,13 +13260,13 @@
                 <w:i w:val="0"/>
                 <w:sz w:val="18"/>
               </w:rPr>
-              <w:t>Confirmation of extracted entities</w:t>
-            </w:r>
-          </w:p>
-        </w:tc>
-        <w:tc>
-          <w:tcPr>
-            <w:tcW w:type="dxa" w:w="4535"/>
+              <w:t>Doctor: confirmation of extracted entities</w:t>
+            </w:r>
+          </w:p>
+        </w:tc>
+        <w:tc>
+          <w:tcPr>
+            <w:tcW w:type="dxa" w:w="3969"/>
             <w:shd w:val="clear" w:color="auto" w:fill="F4F1F2"/>
           </w:tcPr>
           <w:p>
@@ -13308,7 +13308,7 @@
         </w:tc>
         <w:tc>
           <w:tcPr>
-            <w:tcW w:type="dxa" w:w="4195"/>
+            <w:tcW w:type="dxa" w:w="4762"/>
           </w:tcPr>
           <w:p>
             <w:pPr>
@@ -13320,13 +13320,13 @@
                 <w:i w:val="0"/>
                 <w:sz w:val="18"/>
               </w:rPr>
-              <w:t>Check result: can, caution, cannot; drug search</w:t>
-            </w:r>
-          </w:p>
-        </w:tc>
-        <w:tc>
-          <w:tcPr>
-            <w:tcW w:type="dxa" w:w="4535"/>
+              <w:t>Doctor: check result (can, caution, cannot), drug search</w:t>
+            </w:r>
+          </w:p>
+        </w:tc>
+        <w:tc>
+          <w:tcPr>
+            <w:tcW w:type="dxa" w:w="3969"/>
           </w:tcPr>
           <w:p>
             <w:pPr>
@@ -13368,7 +13368,7 @@
         </w:tc>
         <w:tc>
           <w:tcPr>
-            <w:tcW w:type="dxa" w:w="4195"/>
+            <w:tcW w:type="dxa" w:w="4762"/>
             <w:shd w:val="clear" w:color="auto" w:fill="F4F1F2"/>
           </w:tcPr>
           <w:p>
@@ -13381,13 +13381,13 @@
                 <w:i w:val="0"/>
                 <w:sz w:val="18"/>
               </w:rPr>
-              <w:t>Dosing schedule</w:t>
-            </w:r>
-          </w:p>
-        </w:tc>
-        <w:tc>
-          <w:tcPr>
-            <w:tcW w:type="dxa" w:w="4535"/>
+              <w:t>Doctor: dosing schedule</w:t>
+            </w:r>
+          </w:p>
+        </w:tc>
+        <w:tc>
+          <w:tcPr>
+            <w:tcW w:type="dxa" w:w="3969"/>
             <w:shd w:val="clear" w:color="auto" w:fill="F4F1F2"/>
           </w:tcPr>
           <w:p>
@@ -13429,7 +13429,7 @@
         </w:tc>
         <w:tc>
           <w:tcPr>
-            <w:tcW w:type="dxa" w:w="4195"/>
+            <w:tcW w:type="dxa" w:w="4762"/>
           </w:tcPr>
           <w:p>
             <w:pPr>
@@ -13441,13 +13441,13 @@
                 <w:i w:val="0"/>
                 <w:sz w:val="18"/>
               </w:rPr>
-              <w:t>Patient profile</w:t>
-            </w:r>
-          </w:p>
-        </w:tc>
-        <w:tc>
-          <w:tcPr>
-            <w:tcW w:type="dxa" w:w="4535"/>
+              <w:t>Doctor: patient profile at the appointment</w:t>
+            </w:r>
+          </w:p>
+        </w:tc>
+        <w:tc>
+          <w:tcPr>
+            <w:tcW w:type="dxa" w:w="3969"/>
           </w:tcPr>
           <w:p>
             <w:pPr>
@@ -13459,7 +13459,7 @@
                 <w:i w:val="0"/>
                 <w:sz w:val="18"/>
               </w:rPr>
-              <w:t>FR-04, FR-05</w:t>
+              <w:t>FR-06, FR-05</w:t>
             </w:r>
           </w:p>
         </w:tc>
@@ -13489,7 +13489,7 @@
         </w:tc>
         <w:tc>
           <w:tcPr>
-            <w:tcW w:type="dxa" w:w="4195"/>
+            <w:tcW w:type="dxa" w:w="4762"/>
             <w:shd w:val="clear" w:color="auto" w:fill="F4F1F2"/>
           </w:tcPr>
           <w:p>
@@ -13502,13 +13502,13 @@
                 <w:i w:val="0"/>
                 <w:sz w:val="18"/>
               </w:rPr>
-              <w:t>Action journal</w:t>
-            </w:r>
-          </w:p>
-        </w:tc>
-        <w:tc>
-          <w:tcPr>
-            <w:tcW w:type="dxa" w:w="4535"/>
+              <w:t>Doctor: own action journal</w:t>
+            </w:r>
+          </w:p>
+        </w:tc>
+        <w:tc>
+          <w:tcPr>
+            <w:tcW w:type="dxa" w:w="3969"/>
             <w:shd w:val="clear" w:color="auto" w:fill="F4F1F2"/>
           </w:tcPr>
           <w:p>
@@ -13550,7 +13550,7 @@
         </w:tc>
         <w:tc>
           <w:tcPr>
-            <w:tcW w:type="dxa" w:w="4195"/>
+            <w:tcW w:type="dxa" w:w="4762"/>
           </w:tcPr>
           <w:p>
             <w:pPr>
@@ -13562,13 +13562,13 @@
                 <w:i w:val="0"/>
                 <w:sz w:val="18"/>
               </w:rPr>
-              <w:t>Administration (to be revised)</w:t>
-            </w:r>
-          </w:p>
-        </w:tc>
-        <w:tc>
-          <w:tcPr>
-            <w:tcW w:type="dxa" w:w="4535"/>
+              <w:t>Doctor: publish free time slots</w:t>
+            </w:r>
+          </w:p>
+        </w:tc>
+        <w:tc>
+          <w:tcPr>
+            <w:tcW w:type="dxa" w:w="3969"/>
           </w:tcPr>
           <w:p>
             <w:pPr>
@@ -13580,7 +13580,7 @@
                 <w:i w:val="0"/>
                 <w:sz w:val="18"/>
               </w:rPr>
-              <w:t>FR-39, FR-40, FR-41, FR-42</w:t>
+              <w:t>FR-09, FR-12</w:t>
             </w:r>
           </w:p>
         </w:tc>
@@ -13610,7 +13610,7 @@
         </w:tc>
         <w:tc>
           <w:tcPr>
-            <w:tcW w:type="dxa" w:w="4195"/>
+            <w:tcW w:type="dxa" w:w="4762"/>
             <w:shd w:val="clear" w:color="auto" w:fill="F4F1F2"/>
           </w:tcPr>
           <w:p>
@@ -13623,13 +13623,13 @@
                 <w:i w:val="0"/>
                 <w:sz w:val="18"/>
               </w:rPr>
-              <w:t>Pre-visit questionnaire</w:t>
-            </w:r>
-          </w:p>
-        </w:tc>
-        <w:tc>
-          <w:tcPr>
-            <w:tcW w:type="dxa" w:w="4535"/>
+              <w:t>Patient: create a profile, 3 steps</w:t>
+            </w:r>
+          </w:p>
+        </w:tc>
+        <w:tc>
+          <w:tcPr>
+            <w:tcW w:type="dxa" w:w="3969"/>
             <w:shd w:val="clear" w:color="auto" w:fill="F4F1F2"/>
           </w:tcPr>
           <w:p>
@@ -13642,7 +13642,7 @@
                 <w:i w:val="0"/>
                 <w:sz w:val="18"/>
               </w:rPr>
-              <w:t>FR-15</w:t>
+              <w:t>FR-04</w:t>
             </w:r>
           </w:p>
         </w:tc>
@@ -13671,7 +13671,7 @@
         </w:tc>
         <w:tc>
           <w:tcPr>
-            <w:tcW w:type="dxa" w:w="4195"/>
+            <w:tcW w:type="dxa" w:w="4762"/>
           </w:tcPr>
           <w:p>
             <w:pPr>
@@ -13683,13 +13683,13 @@
                 <w:i w:val="0"/>
                 <w:sz w:val="18"/>
               </w:rPr>
-              <w:t>Telegram bot dialogue</w:t>
-            </w:r>
-          </w:p>
-        </w:tc>
-        <w:tc>
-          <w:tcPr>
-            <w:tcW w:type="dxa" w:w="4535"/>
+              <w:t>Patient: my history with source labels</w:t>
+            </w:r>
+          </w:p>
+        </w:tc>
+        <w:tc>
+          <w:tcPr>
+            <w:tcW w:type="dxa" w:w="3969"/>
           </w:tcPr>
           <w:p>
             <w:pPr>
@@ -13701,7 +13701,7 @@
                 <w:i w:val="0"/>
                 <w:sz w:val="18"/>
               </w:rPr>
-              <w:t>FR-37, FR-36, FR-15</w:t>
+              <w:t>FR-05, FR-08</w:t>
             </w:r>
           </w:p>
         </w:tc>
@@ -13731,7 +13731,7 @@
         </w:tc>
         <w:tc>
           <w:tcPr>
-            <w:tcW w:type="dxa" w:w="4195"/>
+            <w:tcW w:type="dxa" w:w="4762"/>
             <w:shd w:val="clear" w:color="auto" w:fill="F4F1F2"/>
           </w:tcPr>
           <w:p>
@@ -13744,13 +13744,13 @@
                 <w:i w:val="0"/>
                 <w:sz w:val="18"/>
               </w:rPr>
-              <w:t>Visit record with patient-reported answers</w:t>
-            </w:r>
-          </w:p>
-        </w:tc>
-        <w:tc>
-          <w:tcPr>
-            <w:tcW w:type="dxa" w:w="4535"/>
+              <w:t>Patient: book a free slot</w:t>
+            </w:r>
+          </w:p>
+        </w:tc>
+        <w:tc>
+          <w:tcPr>
+            <w:tcW w:type="dxa" w:w="3969"/>
             <w:shd w:val="clear" w:color="auto" w:fill="F4F1F2"/>
           </w:tcPr>
           <w:p>
@@ -13763,7 +13763,491 @@
                 <w:i w:val="0"/>
                 <w:sz w:val="18"/>
               </w:rPr>
+              <w:t>FR-10, FR-11</w:t>
+            </w:r>
+          </w:p>
+        </w:tc>
+      </w:tr>
+      <w:tr>
+        <w:trPr>
+          <w:cantSplit w:val="true"/>
+        </w:trPr>
+        <w:tc>
+          <w:tcPr>
+            <w:tcW w:type="dxa" w:w="907"/>
+          </w:tcPr>
+          <w:p>
+            <w:pPr>
+              <w:spacing w:after="30" w:line="252" w:lineRule="auto"/>
+            </w:pPr>
+            <w:r>
+              <w:rPr>
+                <w:b w:val="0"/>
+                <w:i w:val="0"/>
+                <w:sz w:val="18"/>
+              </w:rPr>
+              <w:t>15</w:t>
+            </w:r>
+          </w:p>
+        </w:tc>
+        <w:tc>
+          <w:tcPr>
+            <w:tcW w:type="dxa" w:w="4762"/>
+          </w:tcPr>
+          <w:p>
+            <w:pPr>
+              <w:spacing w:after="30" w:line="252" w:lineRule="auto"/>
+            </w:pPr>
+            <w:r>
+              <w:rPr>
+                <w:b w:val="0"/>
+                <w:i w:val="0"/>
+                <w:sz w:val="18"/>
+              </w:rPr>
+              <w:t>Patient: my appointments, cancel, Telegram reminders</w:t>
+            </w:r>
+          </w:p>
+        </w:tc>
+        <w:tc>
+          <w:tcPr>
+            <w:tcW w:type="dxa" w:w="3969"/>
+          </w:tcPr>
+          <w:p>
+            <w:pPr>
+              <w:spacing w:after="30" w:line="252" w:lineRule="auto"/>
+            </w:pPr>
+            <w:r>
+              <w:rPr>
+                <w:b w:val="0"/>
+                <w:i w:val="0"/>
+                <w:sz w:val="18"/>
+              </w:rPr>
+              <w:t>FR-11, FR-14, FR-36</w:t>
+            </w:r>
+          </w:p>
+        </w:tc>
+      </w:tr>
+      <w:tr>
+        <w:trPr>
+          <w:cantSplit w:val="true"/>
+        </w:trPr>
+        <w:tc>
+          <w:tcPr>
+            <w:tcW w:type="dxa" w:w="907"/>
+            <w:shd w:val="clear" w:color="auto" w:fill="F4F1F2"/>
+          </w:tcPr>
+          <w:p>
+            <w:pPr>
+              <w:spacing w:after="30" w:line="252" w:lineRule="auto"/>
+            </w:pPr>
+            <w:r>
+              <w:rPr>
+                <w:b w:val="0"/>
+                <w:i w:val="0"/>
+                <w:sz w:val="18"/>
+              </w:rPr>
+              <w:t>16</w:t>
+            </w:r>
+          </w:p>
+        </w:tc>
+        <w:tc>
+          <w:tcPr>
+            <w:tcW w:type="dxa" w:w="4762"/>
+            <w:shd w:val="clear" w:color="auto" w:fill="F4F1F2"/>
+          </w:tcPr>
+          <w:p>
+            <w:pPr>
+              <w:spacing w:after="30" w:line="252" w:lineRule="auto"/>
+            </w:pPr>
+            <w:r>
+              <w:rPr>
+                <w:b w:val="0"/>
+                <w:i w:val="0"/>
+                <w:sz w:val="18"/>
+              </w:rPr>
+              <w:t>Patient: medication schedule and dose marks</w:t>
+            </w:r>
+          </w:p>
+        </w:tc>
+        <w:tc>
+          <w:tcPr>
+            <w:tcW w:type="dxa" w:w="3969"/>
+            <w:shd w:val="clear" w:color="auto" w:fill="F4F1F2"/>
+          </w:tcPr>
+          <w:p>
+            <w:pPr>
+              <w:spacing w:after="30" w:line="252" w:lineRule="auto"/>
+            </w:pPr>
+            <w:r>
+              <w:rPr>
+                <w:b w:val="0"/>
+                <w:i w:val="0"/>
+                <w:sz w:val="18"/>
+              </w:rPr>
+              <w:t>FR-35, FR-36, FR-38</w:t>
+            </w:r>
+          </w:p>
+        </w:tc>
+      </w:tr>
+      <w:tr>
+        <w:trPr>
+          <w:cantSplit w:val="true"/>
+        </w:trPr>
+        <w:tc>
+          <w:tcPr>
+            <w:tcW w:type="dxa" w:w="907"/>
+          </w:tcPr>
+          <w:p>
+            <w:pPr>
+              <w:spacing w:after="30" w:line="252" w:lineRule="auto"/>
+            </w:pPr>
+            <w:r>
+              <w:rPr>
+                <w:b w:val="0"/>
+                <w:i w:val="0"/>
+                <w:sz w:val="18"/>
+              </w:rPr>
+              <w:t>17</w:t>
+            </w:r>
+          </w:p>
+        </w:tc>
+        <w:tc>
+          <w:tcPr>
+            <w:tcW w:type="dxa" w:w="4762"/>
+          </w:tcPr>
+          <w:p>
+            <w:pPr>
+              <w:spacing w:after="30" w:line="252" w:lineRule="auto"/>
+            </w:pPr>
+            <w:r>
+              <w:rPr>
+                <w:b w:val="0"/>
+                <w:i w:val="0"/>
+                <w:sz w:val="18"/>
+              </w:rPr>
+              <w:t>Patient: pre-visit questionnaire</w:t>
+            </w:r>
+          </w:p>
+        </w:tc>
+        <w:tc>
+          <w:tcPr>
+            <w:tcW w:type="dxa" w:w="3969"/>
+          </w:tcPr>
+          <w:p>
+            <w:pPr>
+              <w:spacing w:after="30" w:line="252" w:lineRule="auto"/>
+            </w:pPr>
+            <w:r>
+              <w:rPr>
+                <w:b w:val="0"/>
+                <w:i w:val="0"/>
+                <w:sz w:val="18"/>
+              </w:rPr>
+              <w:t>FR-15</w:t>
+            </w:r>
+          </w:p>
+        </w:tc>
+      </w:tr>
+      <w:tr>
+        <w:trPr>
+          <w:cantSplit w:val="true"/>
+        </w:trPr>
+        <w:tc>
+          <w:tcPr>
+            <w:tcW w:type="dxa" w:w="907"/>
+            <w:shd w:val="clear" w:color="auto" w:fill="F4F1F2"/>
+          </w:tcPr>
+          <w:p>
+            <w:pPr>
+              <w:spacing w:after="30" w:line="252" w:lineRule="auto"/>
+            </w:pPr>
+            <w:r>
+              <w:rPr>
+                <w:b w:val="0"/>
+                <w:i w:val="0"/>
+                <w:sz w:val="18"/>
+              </w:rPr>
+              <w:t>18</w:t>
+            </w:r>
+          </w:p>
+        </w:tc>
+        <w:tc>
+          <w:tcPr>
+            <w:tcW w:type="dxa" w:w="4762"/>
+            <w:shd w:val="clear" w:color="auto" w:fill="F4F1F2"/>
+          </w:tcPr>
+          <w:p>
+            <w:pPr>
+              <w:spacing w:after="30" w:line="252" w:lineRule="auto"/>
+            </w:pPr>
+            <w:r>
+              <w:rPr>
+                <w:b w:val="0"/>
+                <w:i w:val="0"/>
+                <w:sz w:val="18"/>
+              </w:rPr>
+              <w:t>Patient: Telegram bot dialogue</w:t>
+            </w:r>
+          </w:p>
+        </w:tc>
+        <w:tc>
+          <w:tcPr>
+            <w:tcW w:type="dxa" w:w="3969"/>
+            <w:shd w:val="clear" w:color="auto" w:fill="F4F1F2"/>
+          </w:tcPr>
+          <w:p>
+            <w:pPr>
+              <w:spacing w:after="30" w:line="252" w:lineRule="auto"/>
+            </w:pPr>
+            <w:r>
+              <w:rPr>
+                <w:b w:val="0"/>
+                <w:i w:val="0"/>
+                <w:sz w:val="18"/>
+              </w:rPr>
+              <w:t>FR-37, FR-36, FR-15</w:t>
+            </w:r>
+          </w:p>
+        </w:tc>
+      </w:tr>
+      <w:tr>
+        <w:trPr>
+          <w:cantSplit w:val="true"/>
+        </w:trPr>
+        <w:tc>
+          <w:tcPr>
+            <w:tcW w:type="dxa" w:w="907"/>
+          </w:tcPr>
+          <w:p>
+            <w:pPr>
+              <w:spacing w:after="30" w:line="252" w:lineRule="auto"/>
+            </w:pPr>
+            <w:r>
+              <w:rPr>
+                <w:b w:val="0"/>
+                <w:i w:val="0"/>
+                <w:sz w:val="18"/>
+              </w:rPr>
+              <w:t>19</w:t>
+            </w:r>
+          </w:p>
+        </w:tc>
+        <w:tc>
+          <w:tcPr>
+            <w:tcW w:type="dxa" w:w="4762"/>
+          </w:tcPr>
+          <w:p>
+            <w:pPr>
+              <w:spacing w:after="30" w:line="252" w:lineRule="auto"/>
+            </w:pPr>
+            <w:r>
+              <w:rPr>
+                <w:b w:val="0"/>
+                <w:i w:val="0"/>
+                <w:sz w:val="18"/>
+              </w:rPr>
+              <w:t>Doctor: visit record with patient-reported answers</w:t>
+            </w:r>
+          </w:p>
+        </w:tc>
+        <w:tc>
+          <w:tcPr>
+            <w:tcW w:type="dxa" w:w="3969"/>
+          </w:tcPr>
+          <w:p>
+            <w:pPr>
+              <w:spacing w:after="30" w:line="252" w:lineRule="auto"/>
+            </w:pPr>
+            <w:r>
+              <w:rPr>
+                <w:b w:val="0"/>
+                <w:i w:val="0"/>
+                <w:sz w:val="18"/>
+              </w:rPr>
               <w:t>FR-15, FR-16</w:t>
+            </w:r>
+          </w:p>
+        </w:tc>
+      </w:tr>
+      <w:tr>
+        <w:trPr>
+          <w:cantSplit w:val="true"/>
+        </w:trPr>
+        <w:tc>
+          <w:tcPr>
+            <w:tcW w:type="dxa" w:w="907"/>
+            <w:shd w:val="clear" w:color="auto" w:fill="F4F1F2"/>
+          </w:tcPr>
+          <w:p>
+            <w:pPr>
+              <w:spacing w:after="30" w:line="252" w:lineRule="auto"/>
+            </w:pPr>
+            <w:r>
+              <w:rPr>
+                <w:b w:val="0"/>
+                <w:i w:val="0"/>
+                <w:sz w:val="18"/>
+              </w:rPr>
+              <w:t>20</w:t>
+            </w:r>
+          </w:p>
+        </w:tc>
+        <w:tc>
+          <w:tcPr>
+            <w:tcW w:type="dxa" w:w="4762"/>
+            <w:shd w:val="clear" w:color="auto" w:fill="F4F1F2"/>
+          </w:tcPr>
+          <w:p>
+            <w:pPr>
+              <w:spacing w:after="30" w:line="252" w:lineRule="auto"/>
+            </w:pPr>
+            <w:r>
+              <w:rPr>
+                <w:b w:val="0"/>
+                <w:i w:val="0"/>
+                <w:sz w:val="18"/>
+              </w:rPr>
+              <w:t>Administrator: overview of clinics and doctors</w:t>
+            </w:r>
+          </w:p>
+        </w:tc>
+        <w:tc>
+          <w:tcPr>
+            <w:tcW w:type="dxa" w:w="3969"/>
+            <w:shd w:val="clear" w:color="auto" w:fill="F4F1F2"/>
+          </w:tcPr>
+          <w:p>
+            <w:pPr>
+              <w:spacing w:after="30" w:line="252" w:lineRule="auto"/>
+            </w:pPr>
+            <w:r>
+              <w:rPr>
+                <w:b w:val="0"/>
+                <w:i w:val="0"/>
+                <w:sz w:val="18"/>
+              </w:rPr>
+              <w:t>FR-39, FR-40, FR-44</w:t>
+            </w:r>
+          </w:p>
+        </w:tc>
+      </w:tr>
+      <w:tr>
+        <w:trPr>
+          <w:cantSplit w:val="true"/>
+        </w:trPr>
+        <w:tc>
+          <w:tcPr>
+            <w:tcW w:type="dxa" w:w="907"/>
+          </w:tcPr>
+          <w:p>
+            <w:pPr>
+              <w:spacing w:after="30" w:line="252" w:lineRule="auto"/>
+            </w:pPr>
+            <w:r>
+              <w:rPr>
+                <w:b w:val="0"/>
+                <w:i w:val="0"/>
+                <w:sz w:val="18"/>
+              </w:rPr>
+              <w:t>21</w:t>
+            </w:r>
+          </w:p>
+        </w:tc>
+        <w:tc>
+          <w:tcPr>
+            <w:tcW w:type="dxa" w:w="4762"/>
+          </w:tcPr>
+          <w:p>
+            <w:pPr>
+              <w:spacing w:after="30" w:line="252" w:lineRule="auto"/>
+            </w:pPr>
+            <w:r>
+              <w:rPr>
+                <w:b w:val="0"/>
+                <w:i w:val="0"/>
+                <w:sz w:val="18"/>
+              </w:rPr>
+              <w:t>Administrator: login journal</w:t>
+            </w:r>
+          </w:p>
+        </w:tc>
+        <w:tc>
+          <w:tcPr>
+            <w:tcW w:type="dxa" w:w="3969"/>
+          </w:tcPr>
+          <w:p>
+            <w:pPr>
+              <w:spacing w:after="30" w:line="252" w:lineRule="auto"/>
+            </w:pPr>
+            <w:r>
+              <w:rPr>
+                <w:b w:val="0"/>
+                <w:i w:val="0"/>
+                <w:sz w:val="18"/>
+              </w:rPr>
+              <w:t>FR-41, FR-43</w:t>
+            </w:r>
+          </w:p>
+        </w:tc>
+      </w:tr>
+      <w:tr>
+        <w:trPr>
+          <w:cantSplit w:val="true"/>
+        </w:trPr>
+        <w:tc>
+          <w:tcPr>
+            <w:tcW w:type="dxa" w:w="907"/>
+            <w:shd w:val="clear" w:color="auto" w:fill="F4F1F2"/>
+          </w:tcPr>
+          <w:p>
+            <w:pPr>
+              <w:spacing w:after="30" w:line="252" w:lineRule="auto"/>
+            </w:pPr>
+            <w:r>
+              <w:rPr>
+                <w:b w:val="0"/>
+                <w:i w:val="0"/>
+                <w:sz w:val="18"/>
+              </w:rPr>
+              <w:t>22</w:t>
+            </w:r>
+          </w:p>
+        </w:tc>
+        <w:tc>
+          <w:tcPr>
+            <w:tcW w:type="dxa" w:w="4762"/>
+            <w:shd w:val="clear" w:color="auto" w:fill="F4F1F2"/>
+          </w:tcPr>
+          <w:p>
+            <w:pPr>
+              <w:spacing w:after="30" w:line="252" w:lineRule="auto"/>
+            </w:pPr>
+            <w:r>
+              <w:rPr>
+                <w:b w:val="0"/>
+                <w:i w:val="0"/>
+                <w:sz w:val="18"/>
+              </w:rPr>
+              <w:t>Administrator: event journal</w:t>
+            </w:r>
+          </w:p>
+        </w:tc>
+        <w:tc>
+          <w:tcPr>
+            <w:tcW w:type="dxa" w:w="3969"/>
+            <w:shd w:val="clear" w:color="auto" w:fill="F4F1F2"/>
+          </w:tcPr>
+          <w:p>
+            <w:pPr>
+              <w:spacing w:after="30" w:line="252" w:lineRule="auto"/>
+            </w:pPr>
+            <w:r>
+              <w:rPr>
+                <w:b w:val="0"/>
+                <w:i w:val="0"/>
+                <w:sz w:val="18"/>
+              </w:rPr>
+              <w:t>FR-42, FR-43, FR-45</w:t>
             </w:r>
           </w:p>
         </w:tc>

</xml_diff>